<commit_message>
Record SAA-C03 Night 6 progress, add Week 1 teardown script, and update resume variants.
Co-authored-by: Cursor <cursoragent@cursor.com>
</commit_message>
<xml_diff>
--- a/HTML/public/Jonathan_Witcoski_Resume_2026.docx
+++ b/HTML/public/Jonathan_Witcoski_Resume_2026.docx
@@ -100,7 +100,7 @@
           <w:b w:val="0"/>
           <w:sz w:val="22"/>
         </w:rPr>
-        <w:t>Senior GIS Developer with 15+ years building enterprise ArcGIS web applications, spatial databases, and automated geospatial workflows for federal agencies and utilities. Strong match for ArcGIS Enterprise/Online/Pro, Python, JavaScript, SQL, SQL Server, PostgreSQL/PostGIS, and REST API development.</w:t>
+        <w:t>Senior Geospatial Engineer with 15+ years building enterprise ArcGIS web applications, spatial databases, and automated geospatial workflows for federal agencies and utilities. Recent contract delivery for U.S. Postal Service ITS. Strong match for ArcGIS Enterprise/Online/Pro, Python, JavaScript, SQL, SQL Server, PostgreSQL/PostGIS, and REST API development.</w:t>
       </w:r>
     </w:p>
     <w:p>
@@ -223,7 +223,7 @@
           <w:b/>
           <w:sz w:val="22"/>
         </w:rPr>
-        <w:t>Geographer | DRT Strategies (CDC)</w:t>
+        <w:t>Geospatial Engineer | DRT Strategies (CDC)</w:t>
       </w:r>
     </w:p>
     <w:p>
@@ -305,6 +305,28 @@
           <w:sz w:val="22"/>
         </w:rPr>
         <w:t>Remote | October 2025 – Present</w:t>
+      </w:r>
+    </w:p>
+    <w:p>
+      <w:pPr>
+        <w:pStyle w:val="ListBullet"/>
+        <w:spacing w:after="40"/>
+      </w:pPr>
+      <w:r>
+        <w:rPr>
+          <w:rFonts w:ascii="Calibri" w:hAnsi="Calibri" w:eastAsia="Calibri"/>
+          <w:b/>
+          <w:sz w:val="22"/>
+        </w:rPr>
+        <w:t>GIS Map Developer (contract)</w:t>
+      </w:r>
+      <w:r>
+        <w:rPr>
+          <w:rFonts w:ascii="Calibri" w:hAnsi="Calibri" w:eastAsia="Calibri"/>
+          <w:b w:val="0"/>
+          <w:sz w:val="22"/>
+        </w:rPr>
+        <w:t xml:space="preserve"> — U.S. Postal Service ITS via PlanIT Group | Remote | April 2026 – May 2026: designed and developed interactive web mapping applications with ArcGIS, JavaScript, and Python; translated business requirements into geospatial software designs with spatial analysis, ETL workflows, and database-backed map services; collaborated with USPS stakeholders on spatial data management and cartography</w:t>
       </w:r>
     </w:p>
     <w:p>

</xml_diff>

<commit_message>
Move map agent graders and rumble off the personal homepage.
Agent eval demos now live in jwitcoski/map-agent-arena; keep Antikythera and ski drive-time on-site with external arena links.

Co-authored-by: Cursor <cursoragent@cursor.com>
</commit_message>
<xml_diff>
--- a/HTML/public/Jonathan_Witcoski_Resume_2026.docx
+++ b/HTML/public/Jonathan_Witcoski_Resume_2026.docx
@@ -100,7 +100,7 @@
           <w:b w:val="0"/>
           <w:sz w:val="22"/>
         </w:rPr>
-        <w:t>Senior Geospatial Engineer with 15+ years building enterprise ArcGIS web applications, spatial databases, and automated geospatial workflows for federal agencies and utilities. Recent contract delivery for U.S. Postal Service ITS. Strong match for ArcGIS Enterprise/Online/Pro, Python, JavaScript, SQL, SQL Server, PostgreSQL/PostGIS, and REST API development.</w:t>
+        <w:t>Senior GIS Developer with 15+ years building enterprise ArcGIS web applications, spatial databases, and automated geospatial workflows for federal agencies and utilities. Strong match for ArcGIS Enterprise/Online/Pro, Python, JavaScript, SQL, SQL Server, PostgreSQL/PostGIS, and REST API development.</w:t>
       </w:r>
     </w:p>
     <w:p>
@@ -223,7 +223,7 @@
           <w:b/>
           <w:sz w:val="22"/>
         </w:rPr>
-        <w:t>Geospatial Engineer | DRT Strategies (CDC)</w:t>
+        <w:t>Geospatial Engineer | INCATech</w:t>
       </w:r>
     </w:p>
     <w:p>
@@ -236,7 +236,129 @@
           <w:b w:val="0"/>
           <w:sz w:val="22"/>
         </w:rPr>
-        <w:t>Remote | March 2022 – Present</w:t>
+        <w:t>Northern Virginia | 2026 – Present</w:t>
+      </w:r>
+    </w:p>
+    <w:p>
+      <w:pPr>
+        <w:pStyle w:val="ListBullet"/>
+        <w:spacing w:after="40"/>
+      </w:pPr>
+      <w:r>
+        <w:rPr>
+          <w:rFonts w:ascii="Calibri" w:hAnsi="Calibri" w:eastAsia="Calibri"/>
+          <w:b w:val="0"/>
+          <w:sz w:val="22"/>
+        </w:rPr>
+        <w:t>Design, build, and maintain enterprise geodatabases and geospatial workflows with ArcGIS Enterprise, Online, and Desktop for IC and USPIS missions</w:t>
+      </w:r>
+    </w:p>
+    <w:p>
+      <w:pPr>
+        <w:pStyle w:val="ListBullet"/>
+        <w:spacing w:after="40"/>
+      </w:pPr>
+      <w:r>
+        <w:rPr>
+          <w:rFonts w:ascii="Calibri" w:hAnsi="Calibri" w:eastAsia="Calibri"/>
+          <w:b w:val="0"/>
+          <w:sz w:val="22"/>
+        </w:rPr>
+        <w:t>Automate spatial analysis, data validation, and ETL with Python and SQL across Oracle, SQL Server, and PostgreSQL</w:t>
+      </w:r>
+    </w:p>
+    <w:p>
+      <w:pPr>
+        <w:pStyle w:val="ListBullet"/>
+        <w:spacing w:after="40"/>
+      </w:pPr>
+      <w:r>
+        <w:rPr>
+          <w:rFonts w:ascii="Calibri" w:hAnsi="Calibri" w:eastAsia="Calibri"/>
+          <w:b w:val="0"/>
+          <w:sz w:val="22"/>
+        </w:rPr>
+        <w:t>Produce web maps and visualizations, and support GIS users with troubleshooting, migrations, and documentation</w:t>
+      </w:r>
+    </w:p>
+    <w:p>
+      <w:pPr>
+        <w:spacing w:before="120" w:after="40"/>
+      </w:pPr>
+      <w:r>
+        <w:rPr>
+          <w:rFonts w:ascii="Calibri" w:hAnsi="Calibri" w:eastAsia="Calibri"/>
+          <w:b/>
+          <w:sz w:val="22"/>
+        </w:rPr>
+        <w:t>Founder | Vector Scope AI LLC</w:t>
+      </w:r>
+    </w:p>
+    <w:p>
+      <w:pPr>
+        <w:spacing w:after="40"/>
+      </w:pPr>
+      <w:r>
+        <w:rPr>
+          <w:rFonts w:ascii="Calibri" w:hAnsi="Calibri" w:eastAsia="Calibri"/>
+          <w:b w:val="0"/>
+          <w:sz w:val="22"/>
+        </w:rPr>
+        <w:t>Remote | October 2025 – Present</w:t>
+      </w:r>
+    </w:p>
+    <w:p>
+      <w:pPr>
+        <w:pStyle w:val="ListBullet"/>
+        <w:spacing w:after="40"/>
+      </w:pPr>
+      <w:r>
+        <w:rPr>
+          <w:rFonts w:ascii="Calibri" w:hAnsi="Calibri" w:eastAsia="Calibri"/>
+          <w:b w:val="0"/>
+          <w:sz w:val="22"/>
+        </w:rPr>
+        <w:t>Build ArcGIS-connected web tools and Python pipelines for map editing, validation, and data extraction</w:t>
+      </w:r>
+    </w:p>
+    <w:p>
+      <w:pPr>
+        <w:pStyle w:val="ListBullet"/>
+        <w:spacing w:after="40"/>
+      </w:pPr>
+      <w:r>
+        <w:rPr>
+          <w:rFonts w:ascii="Calibri" w:hAnsi="Calibri" w:eastAsia="Calibri"/>
+          <w:b w:val="0"/>
+          <w:sz w:val="22"/>
+        </w:rPr>
+        <w:t>Ship Global Ski Atlas (3,000+ ski areas) as a live JavaScript web mapping demo with automated ETL</w:t>
+      </w:r>
+    </w:p>
+    <w:p>
+      <w:pPr>
+        <w:spacing w:before="120" w:after="40"/>
+      </w:pPr>
+      <w:r>
+        <w:rPr>
+          <w:rFonts w:ascii="Calibri" w:hAnsi="Calibri" w:eastAsia="Calibri"/>
+          <w:b/>
+          <w:sz w:val="22"/>
+        </w:rPr>
+        <w:t>Geographer | DRT Strategies (CDC)</w:t>
+      </w:r>
+    </w:p>
+    <w:p>
+      <w:pPr>
+        <w:spacing w:after="40"/>
+      </w:pPr>
+      <w:r>
+        <w:rPr>
+          <w:rFonts w:ascii="Calibri" w:hAnsi="Calibri" w:eastAsia="Calibri"/>
+          <w:b w:val="0"/>
+          <w:sz w:val="22"/>
+        </w:rPr>
+        <w:t>Remote | March 2022 – 2026</w:t>
       </w:r>
     </w:p>
     <w:p>
@@ -279,82 +401,6 @@
           <w:sz w:val="22"/>
         </w:rPr>
         <w:t>Build SQL Server and PostgreSQL/PostGIS databases and Python/SQL ETL pipelines for recurring geospatial updates</w:t>
-      </w:r>
-    </w:p>
-    <w:p>
-      <w:pPr>
-        <w:spacing w:before="120" w:after="40"/>
-      </w:pPr>
-      <w:r>
-        <w:rPr>
-          <w:rFonts w:ascii="Calibri" w:hAnsi="Calibri" w:eastAsia="Calibri"/>
-          <w:b/>
-          <w:sz w:val="22"/>
-        </w:rPr>
-        <w:t>Founder | Vector Scope AI LLC</w:t>
-      </w:r>
-    </w:p>
-    <w:p>
-      <w:pPr>
-        <w:spacing w:after="40"/>
-      </w:pPr>
-      <w:r>
-        <w:rPr>
-          <w:rFonts w:ascii="Calibri" w:hAnsi="Calibri" w:eastAsia="Calibri"/>
-          <w:b w:val="0"/>
-          <w:sz w:val="22"/>
-        </w:rPr>
-        <w:t>Remote | October 2025 – Present</w:t>
-      </w:r>
-    </w:p>
-    <w:p>
-      <w:pPr>
-        <w:pStyle w:val="ListBullet"/>
-        <w:spacing w:after="40"/>
-      </w:pPr>
-      <w:r>
-        <w:rPr>
-          <w:rFonts w:ascii="Calibri" w:hAnsi="Calibri" w:eastAsia="Calibri"/>
-          <w:b/>
-          <w:sz w:val="22"/>
-        </w:rPr>
-        <w:t>GIS Map Developer (contract)</w:t>
-      </w:r>
-      <w:r>
-        <w:rPr>
-          <w:rFonts w:ascii="Calibri" w:hAnsi="Calibri" w:eastAsia="Calibri"/>
-          <w:b w:val="0"/>
-          <w:sz w:val="22"/>
-        </w:rPr>
-        <w:t xml:space="preserve"> — U.S. Postal Service ITS via PlanIT Group | Remote | April 2026 – May 2026: designed and developed interactive web mapping applications with ArcGIS, JavaScript, and Python; translated business requirements into geospatial software designs with spatial analysis, ETL workflows, and database-backed map services; collaborated with USPS stakeholders on spatial data management and cartography</w:t>
-      </w:r>
-    </w:p>
-    <w:p>
-      <w:pPr>
-        <w:pStyle w:val="ListBullet"/>
-        <w:spacing w:after="40"/>
-      </w:pPr>
-      <w:r>
-        <w:rPr>
-          <w:rFonts w:ascii="Calibri" w:hAnsi="Calibri" w:eastAsia="Calibri"/>
-          <w:b w:val="0"/>
-          <w:sz w:val="22"/>
-        </w:rPr>
-        <w:t>Build ArcGIS-connected web tools and Python pipelines for map editing, validation, and data extraction</w:t>
-      </w:r>
-    </w:p>
-    <w:p>
-      <w:pPr>
-        <w:pStyle w:val="ListBullet"/>
-        <w:spacing w:after="40"/>
-      </w:pPr>
-      <w:r>
-        <w:rPr>
-          <w:rFonts w:ascii="Calibri" w:hAnsi="Calibri" w:eastAsia="Calibri"/>
-          <w:b w:val="0"/>
-          <w:sz w:val="22"/>
-        </w:rPr>
-        <w:t>Ship Global Ski Atlas (3,000+ ski areas) as a live JavaScript web mapping demo with automated ETL</w:t>
       </w:r>
     </w:p>
     <w:p>

</xml_diff>

<commit_message>
Update resumes and Space Force cover letter
</commit_message>
<xml_diff>
--- a/HTML/public/Jonathan_Witcoski_Resume_2026.docx
+++ b/HTML/public/Jonathan_Witcoski_Resume_2026.docx
@@ -87,7 +87,7 @@
           <w:b w:val="0"/>
           <w:sz w:val="22"/>
         </w:rPr>
-        <w:t xml:space="preserve"> DC metro area · previously Reston, VA</w:t>
+        <w:t xml:space="preserve"> Washington, DC metropolitan area (Reston, Virginia)</w:t>
       </w:r>
     </w:p>
     <w:p>
@@ -236,7 +236,7 @@
           <w:b w:val="0"/>
           <w:sz w:val="22"/>
         </w:rPr>
-        <w:t>Northern Virginia | 2026 – Present</w:t>
+        <w:t>Reston, VA | July 2026 – Present</w:t>
       </w:r>
     </w:p>
     <w:p>
@@ -358,7 +358,7 @@
           <w:b w:val="0"/>
           <w:sz w:val="22"/>
         </w:rPr>
-        <w:t>Remote | March 2022 – 2026</w:t>
+        <w:t>Remote | September 2024 – July 2026</w:t>
       </w:r>
     </w:p>
     <w:p>
@@ -401,6 +401,74 @@
           <w:sz w:val="22"/>
         </w:rPr>
         <w:t>Build SQL Server and PostgreSQL/PostGIS databases and Python/SQL ETL pipelines for recurring geospatial updates</w:t>
+      </w:r>
+    </w:p>
+    <w:p>
+      <w:pPr>
+        <w:spacing w:before="120" w:after="40"/>
+      </w:pPr>
+      <w:r>
+        <w:rPr>
+          <w:rFonts w:ascii="Calibri" w:hAnsi="Calibri" w:eastAsia="Calibri"/>
+          <w:b/>
+          <w:sz w:val="22"/>
+        </w:rPr>
+        <w:t>Geographer | Centers for Disease Control and Prevention</w:t>
+      </w:r>
+    </w:p>
+    <w:p>
+      <w:pPr>
+        <w:spacing w:after="40"/>
+      </w:pPr>
+      <w:r>
+        <w:rPr>
+          <w:rFonts w:ascii="Calibri" w:hAnsi="Calibri" w:eastAsia="Calibri"/>
+          <w:b w:val="0"/>
+          <w:sz w:val="22"/>
+        </w:rPr>
+        <w:t>Remote | March 2022 – September 2024</w:t>
+      </w:r>
+    </w:p>
+    <w:p>
+      <w:pPr>
+        <w:pStyle w:val="ListBullet"/>
+        <w:spacing w:after="40"/>
+      </w:pPr>
+      <w:r>
+        <w:rPr>
+          <w:rFonts w:ascii="Calibri" w:hAnsi="Calibri" w:eastAsia="Calibri"/>
+          <w:b w:val="0"/>
+          <w:sz w:val="22"/>
+        </w:rPr>
+        <w:t>Developed web mapping applications and dashboards with ArcGIS Enterprise, JavaScript, React, and Power BI for CDC public health surveillance programs</w:t>
+      </w:r>
+    </w:p>
+    <w:p>
+      <w:pPr>
+        <w:pStyle w:val="ListBullet"/>
+        <w:spacing w:after="40"/>
+      </w:pPr>
+      <w:r>
+        <w:rPr>
+          <w:rFonts w:ascii="Calibri" w:hAnsi="Calibri" w:eastAsia="Calibri"/>
+          <w:b w:val="0"/>
+          <w:sz w:val="22"/>
+        </w:rPr>
+        <w:t>Used R and Python to build automated workflows for raster and vector data extraction, producing PMTiles and GeoParquet datasets that feed dashboards and web maps</w:t>
+      </w:r>
+    </w:p>
+    <w:p>
+      <w:pPr>
+        <w:pStyle w:val="ListBullet"/>
+        <w:spacing w:after="40"/>
+      </w:pPr>
+      <w:r>
+        <w:rPr>
+          <w:rFonts w:ascii="Calibri" w:hAnsi="Calibri" w:eastAsia="Calibri"/>
+          <w:b w:val="0"/>
+          <w:sz w:val="22"/>
+        </w:rPr>
+        <w:t>Built SQL Server and PostgreSQL/PostGIS databases and Python/SQL ETL pipelines for recurring geospatial updates</w:t>
       </w:r>
     </w:p>
     <w:p>

</xml_diff>